<commit_message>
Update Pima Datacenter Firewall Project.docx
</commit_message>
<xml_diff>
--- a/report/Pima Datacenter Firewall Project.docx
+++ b/report/Pima Datacenter Firewall Project.docx
@@ -6,8 +6,6 @@
       <w:pPr>
         <w:spacing w:before="480" w:after="120"/>
         <w:jc w:val="center"/>
-      </w:pPr>
-      <w:r>
         <w:rPr>
           <w:b/>
           <w:bCs/>
@@ -15,7 +13,26 @@
           <w:sz w:val="52"/>
           <w:szCs w:val="52"/>
         </w:rPr>
-        <w:t>Palo Alto NGFW — Secure Network Lab</w:t>
+      </w:pPr>
+      <w:r>
+        <w:rPr>
+          <w:b/>
+          <w:bCs/>
+          <w:color w:val="1F4E79"/>
+          <w:sz w:val="52"/>
+          <w:szCs w:val="52"/>
+        </w:rPr>
+        <w:t xml:space="preserve">Pima Datacenter Firewall </w:t>
+      </w:r>
+      <w:r>
+        <w:rPr>
+          <w:b/>
+          <w:bCs/>
+          <w:color w:val="1F4E79"/>
+          <w:sz w:val="52"/>
+          <w:szCs w:val="52"/>
+        </w:rPr>
+        <w:t>Lab</w:t>
       </w:r>
     </w:p>
     <w:p>
@@ -31,6 +48,14 @@
         </w:rPr>
         <w:t>Cybersecurity Portfolio Project</w:t>
       </w:r>
+      <w:r>
+        <w:rPr>
+          <w:color w:val="555555"/>
+          <w:sz w:val="28"/>
+          <w:szCs w:val="28"/>
+        </w:rPr>
+        <w:t xml:space="preserve"> – Macario Givens</w:t>
+      </w:r>
     </w:p>
     <w:p>
       <w:pPr>
@@ -41,7 +66,7 @@
         <w:rPr>
           <w:color w:val="888888"/>
         </w:rPr>
-        <w:t>Pima Community College  |  CIS284</w:t>
+        <w:t xml:space="preserve">Pima Community College  </w:t>
       </w:r>
     </w:p>
     <w:p>
@@ -233,7 +258,6 @@
         <w:spacing w:before="60" w:after="60"/>
       </w:pPr>
       <w:r>
-        <w:lastRenderedPageBreak/>
         <w:t>Ubuntu Desktop as one of the primary internal hosts</w:t>
       </w:r>
     </w:p>
@@ -265,6 +289,7 @@
         <w:spacing w:before="60" w:after="60"/>
       </w:pPr>
       <w:r>
+        <w:lastRenderedPageBreak/>
         <w:t>Switches and physical hardware provided in the Pima Data Center</w:t>
       </w:r>
     </w:p>
@@ -389,23 +414,7 @@
         <w:spacing w:before="80" w:after="80"/>
       </w:pPr>
       <w:r>
-        <w:t xml:space="preserve">During the </w:t>
-      </w:r>
-      <w:proofErr w:type="gramStart"/>
-      <w:r>
-        <w:t>initial environment</w:t>
-      </w:r>
-      <w:proofErr w:type="gramEnd"/>
-      <w:r>
-        <w:t xml:space="preserve"> setup, we configured the core switch and hypervisor used in the lab. The switch was </w:t>
-      </w:r>
-      <w:proofErr w:type="gramStart"/>
-      <w:r>
-        <w:t>assigned</w:t>
-      </w:r>
-      <w:proofErr w:type="gramEnd"/>
-      <w:r>
-        <w:t xml:space="preserve"> a management VLAN IP, default gateway, and DNS settings. Remote access to the switch and </w:t>
+        <w:t xml:space="preserve">During the initial environment setup, we configured the core switch and hypervisor used in the lab. The switch was assigned a management VLAN IP, default gateway, and DNS settings. Remote access to the switch and </w:t>
       </w:r>
       <w:proofErr w:type="spellStart"/>
       <w:r>
@@ -436,7 +445,6 @@
           <w:bCs/>
           <w:color w:val="1F4E79"/>
         </w:rPr>
-        <w:lastRenderedPageBreak/>
         <w:t xml:space="preserve">Security Note: </w:t>
       </w:r>
       <w:r>
@@ -469,15 +477,7 @@
       </w:r>
       <w:proofErr w:type="spellEnd"/>
       <w:r>
-        <w:t xml:space="preserve"> environment and connecting the server to the </w:t>
-      </w:r>
-      <w:proofErr w:type="gramStart"/>
-      <w:r>
-        <w:t>internet, but</w:t>
-      </w:r>
-      <w:proofErr w:type="gramEnd"/>
-      <w:r>
-        <w:t xml:space="preserve"> resolved these issues through team collaboration and reinstalling </w:t>
+        <w:t xml:space="preserve"> environment and connecting the server to the internet, but resolved these issues through team collaboration and reinstalling </w:t>
       </w:r>
       <w:proofErr w:type="spellStart"/>
       <w:r>
@@ -627,7 +627,6 @@
         <w:spacing w:before="80" w:after="80"/>
       </w:pPr>
       <w:r>
-        <w:lastRenderedPageBreak/>
         <w:t>Throughout the project, we conducted continuous testing to verify that each part of the network functioned as intended. This included checking connectivity between virtual machines, validating GUI and CLI access to the Palo Alto firewall, and confirming that both internal and remote devices could reach the internet through the configured policies and NAT rules.</w:t>
       </w:r>
     </w:p>
@@ -1801,15 +1800,7 @@
         <w:spacing w:before="80" w:after="80"/>
       </w:pPr>
       <w:r>
-        <w:t xml:space="preserve">There are several opportunities to expand and enhance the work completed </w:t>
-      </w:r>
-      <w:proofErr w:type="gramStart"/>
-      <w:r>
-        <w:t>in</w:t>
-      </w:r>
-      <w:proofErr w:type="gramEnd"/>
-      <w:r>
-        <w:t xml:space="preserve"> this project:</w:t>
+        <w:t>There are several opportunities to expand and enhance the work completed in this project:</w:t>
       </w:r>
     </w:p>
     <w:p>
@@ -1925,13 +1916,8 @@
       <w:pPr>
         <w:spacing w:before="80" w:after="80"/>
       </w:pPr>
-      <w:proofErr w:type="gramStart"/>
-      <w:r>
-        <w:t>All of</w:t>
-      </w:r>
-      <w:proofErr w:type="gramEnd"/>
-      <w:r>
-        <w:t xml:space="preserve"> these enhancements would turn the environment into a more complete enterprise-level security lab.</w:t>
+      <w:r>
+        <w:t>All of these enhancements would turn the environment into a more complete enterprise-level security lab.</w:t>
       </w:r>
     </w:p>
     <w:p>
@@ -2043,15 +2029,7 @@
         <w:spacing w:before="80" w:after="80"/>
       </w:pPr>
       <w:r>
-        <w:t xml:space="preserve">Overall, this project has been </w:t>
-      </w:r>
-      <w:proofErr w:type="gramStart"/>
-      <w:r>
-        <w:t>a valuable</w:t>
-      </w:r>
-      <w:proofErr w:type="gramEnd"/>
-      <w:r>
-        <w:t xml:space="preserve"> experience in networking and firewall deployment. I learned a lot across different areas of IT and genuinely enjoyed working on it with my teammates. Even with all the issues we ran into, we pushed through and made everything work to the best of our abilities.</w:t>
+        <w:t>Overall, this project has been a valuable experience in networking and firewall deployment. I learned a lot across different areas of IT and genuinely enjoyed working on it with my teammates. Even with all the issues we ran into, we pushed through and made everything work to the best of our abilities.</w:t>
       </w:r>
     </w:p>
     <w:p>
@@ -3348,7 +3326,7 @@
   </inkml:definitions>
   <inkml:trace contextRef="#ctx0" brushRef="#br0">0 139 24575,'6'-6'0,"5"-2"0,10-6 0,4 0 0,6-3 0,5 0 0,-1 4 0,2-3 0,1 2 0,-3 4 0,-4 2 0,-7 7 0,-9 3-8191</inkml:trace>
   <inkml:trace contextRef="#ctx0" brushRef="#br0" timeOffset="606.11">335 156 24575,'6'0'0,"8"-6"0,8-2 0,5 0 0,5-4 0,3 0 0,-5 2-8191</inkml:trace>
-  <inkml:trace contextRef="#ctx0" brushRef="#br0" timeOffset="1152.36">53 227 24575,'6'0'0,"8"0"0,7 0 0,7 0 0,4 0 0,-3 0-8191</inkml:trace>
+  <inkml:trace contextRef="#ctx0" brushRef="#br0" timeOffset="1152.35">53 227 24575,'6'0'0,"8"0"0,7 0 0,7 0 0,4 0 0,-3 0-8191</inkml:trace>
   <inkml:trace contextRef="#ctx0" brushRef="#br0" timeOffset="1710.91">16 262 24575,'6'-9'0,"8"-3"0,8-6 0,6 1 0,4 3 0,3 4 0,-5 4-8191</inkml:trace>
 </inkml:ink>
 </file>

</xml_diff>